<commit_message>
Restore Stockholm to Europe as encounter 18
Adds Stockholm back into the Europe region (mx=40,my=32) with its
original Erik Lindqvist / Nordic Oil Distribution storyline fully
intact, wires a van tint for id 18, and restores its section in
encounters.md. Boss gate now requires clearing 18 distributors
(7 Europeans including Stockholm + 11 across the other regions)
before Automechanika unlocks.
</commit_message>
<xml_diff>
--- a/encounters.docx
+++ b/encounters.docx
@@ -3738,6 +3738,248 @@
       </w:pPr>
       <w:r>
         <w:t>Resistance (wrong-pillar / ineffective): TODO</w:t>
+      </w:r>
+    </w:p>
+    <w:p/>
+    <w:p/>
+    <w:p/>
+    <w:p>
+      <w:pPr>
+        <w:pStyle w:val="Heading2"/>
+      </w:pPr>
+      <w:r>
+        <w:t>Encounter 18: Stockholm, Sweden</w:t>
+      </w:r>
+    </w:p>
+    <w:p>
+      <w:r>
+        <w:t>*(Segment B)*</w:t>
+      </w:r>
+    </w:p>
+    <w:p/>
+    <w:p>
+      <w:r>
+        <w:t>**Distributor:** Erik Lindqvist · Commercial Director</w:t>
+      </w:r>
+    </w:p>
+    <w:p>
+      <w:r>
+        <w:t>**Company:** Nordic Oil Distribution</w:t>
+      </w:r>
+    </w:p>
+    <w:p>
+      <w:r>
+        <w:t>**Channel:** 80 fleet operators + 45 HD workshops</w:t>
+      </w:r>
+    </w:p>
+    <w:p>
+      <w:r>
+        <w:t>**Rewards:** +75g · +180 XP</w:t>
+      </w:r>
+    </w:p>
+    <w:p/>
+    <w:p>
+      <w:pPr>
+        <w:pStyle w:val="Heading3"/>
+      </w:pPr>
+      <w:r>
+        <w:t>Opening speech (NPC intro)</w:t>
+      </w:r>
+    </w:p>
+    <w:p>
+      <w:pPr>
+        <w:ind w:left="360"/>
+      </w:pPr>
+      <w:r>
+        <w:t>I manage 12 sales reps. Commercially excellent — great relationships, strong negotiators. But we're losing fleet tenders. When a fleet manager asks about drain intervals or TCO for 200 trucks, my reps go quiet. Last quarter, a competitor brought a lubricant engineer to the pitch and walked away with €400K in contracts. My reps had nothing to counter. I can't hire 12 engineers. I need my team to hold their ground.</w:t>
+      </w:r>
+    </w:p>
+    <w:p/>
+    <w:p>
+      <w:pPr>
+        <w:pStyle w:val="Heading3"/>
+      </w:pPr>
+      <w:r>
+        <w:t>Discovery phase</w:t>
+      </w:r>
+    </w:p>
+    <w:p>
+      <w:r>
+        <w:t>**Situational prompt:** _Erik just lost €400K to a competitor who brought a lubricant engineer to the pitch. Ask the question that uncovers his real problem._</w:t>
+      </w:r>
+    </w:p>
+    <w:p/>
+    <w:p>
+      <w:r>
+        <w:rPr>
+          <w:b/>
+        </w:rPr>
+        <w:t>Discovery questions the salesperson can ask (only ONE is correct):</w:t>
+      </w:r>
+    </w:p>
+    <w:p/>
+    <w:p>
+      <w:r>
+        <w:t>**Option A** ✅ _correct — bonus damage_</w:t>
+      </w:r>
+    </w:p>
+    <w:p>
+      <w:pPr>
+        <w:pStyle w:val="ListBullet"/>
+      </w:pPr>
+      <w:r>
+        <w:t>Question: When your reps face a deep technical question in a fleet meeting, what actually happens in the room?</w:t>
+      </w:r>
+    </w:p>
+    <w:p>
+      <w:pPr>
+        <w:pStyle w:val="ListBullet"/>
+      </w:pPr>
+      <w:r>
+        <w:t>NPC response: Erik: "They say 'I'll get back to you' — but by then the competitor has already answered live." — That confidence gap in the moment IS the problem. Now you can position co-visits.</w:t>
+      </w:r>
+    </w:p>
+    <w:p/>
+    <w:p>
+      <w:r>
+        <w:t>**Option B** ⚠️ _wrong pillar — enemy buff_</w:t>
+      </w:r>
+    </w:p>
+    <w:p>
+      <w:pPr>
+        <w:pStyle w:val="ListBullet"/>
+      </w:pPr>
+      <w:r>
+        <w:t>Question: Could your reps win more tenders if you sharpened their pricing and negotiation?</w:t>
+      </w:r>
+    </w:p>
+    <w:p>
+      <w:pPr>
+        <w:pStyle w:val="ListBullet"/>
+      </w:pPr>
+      <w:r>
+        <w:t>NPC response: Erik: "Pricing? My reps are great negotiators. That's not the gap." — You framed his problem as commercial weakness. He's insulted.</w:t>
+      </w:r>
+    </w:p>
+    <w:p/>
+    <w:p>
+      <w:r>
+        <w:t>**Option C** ➖ _shallow — neutral_</w:t>
+      </w:r>
+    </w:p>
+    <w:p>
+      <w:pPr>
+        <w:pStyle w:val="ListBullet"/>
+      </w:pPr>
+      <w:r>
+        <w:t>Question: Have you considered giving your reps more product brochures and TDS documents?</w:t>
+      </w:r>
+    </w:p>
+    <w:p>
+      <w:pPr>
+        <w:pStyle w:val="ListBullet"/>
+      </w:pPr>
+      <w:r>
+        <w:t>NPC response: Erik: "We have plenty of docs. They don't replace live technical credibility." — A surface-level probe. Missed the real issue.</w:t>
+      </w:r>
+    </w:p>
+    <w:p/>
+    <w:p>
+      <w:pPr>
+        <w:pStyle w:val="Heading3"/>
+      </w:pPr>
+      <w:r>
+        <w:t>Battle objections</w:t>
+      </w:r>
+    </w:p>
+    <w:p/>
+    <w:p>
+      <w:r>
+        <w:t>**Objection 1** (ENABLE pillar · 36 HP)</w:t>
+      </w:r>
+    </w:p>
+    <w:p>
+      <w:pPr>
+        <w:pStyle w:val="ListBullet"/>
+      </w:pPr>
+      <w:r>
+        <w:t>Text: "Training takes my people off the road. We did a day last year — nothing changed."</w:t>
+      </w:r>
+    </w:p>
+    <w:p>
+      <w:pPr>
+        <w:pStyle w:val="ListBullet"/>
+      </w:pPr>
+      <w:r>
+        <w:t>Weakness (super-effective services): physical_training, academy</w:t>
+      </w:r>
+    </w:p>
+    <w:p>
+      <w:pPr>
+        <w:pStyle w:val="ListBullet"/>
+      </w:pPr>
+      <w:r>
+        <w:t>Resistance (wrong-pillar / ineffective): promo_templates, edi</w:t>
+      </w:r>
+    </w:p>
+    <w:p/>
+    <w:p>
+      <w:r>
+        <w:t>**Objection 2** (ENABLE pillar · 40 HP)</w:t>
+      </w:r>
+    </w:p>
+    <w:p>
+      <w:pPr>
+        <w:pStyle w:val="ListBullet"/>
+      </w:pPr>
+      <w:r>
+        <w:t>Text: "We've been burned before. Two days in a classroom, forgotten in a month."</w:t>
+      </w:r>
+    </w:p>
+    <w:p>
+      <w:pPr>
+        <w:pStyle w:val="ListBullet"/>
+      </w:pPr>
+      <w:r>
+        <w:t>Weakness (super-effective services): co_visits</w:t>
+      </w:r>
+    </w:p>
+    <w:p>
+      <w:pPr>
+        <w:pStyle w:val="ListBullet"/>
+      </w:pPr>
+      <w:r>
+        <w:t>Resistance (wrong-pillar / ineffective): marketing_portal, custom_label</w:t>
+      </w:r>
+    </w:p>
+    <w:p/>
+    <w:p>
+      <w:r>
+        <w:t>**Objection 3** (ENABLE pillar · 36 HP)</w:t>
+      </w:r>
+    </w:p>
+    <w:p>
+      <w:pPr>
+        <w:pStyle w:val="ListBullet"/>
+      </w:pPr>
+      <w:r>
+        <w:t>Text: "Fleet managers want lab data — not a sales rep reading from a product sheet."</w:t>
+      </w:r>
+    </w:p>
+    <w:p>
+      <w:pPr>
+        <w:pStyle w:val="ListBullet"/>
+      </w:pPr>
+      <w:r>
+        <w:t>Weakness (super-effective services): oil_analysis, co_visits</w:t>
+      </w:r>
+    </w:p>
+    <w:p>
+      <w:pPr>
+        <w:pStyle w:val="ListBullet"/>
+      </w:pPr>
+      <w:r>
+        <w:t>Resistance (wrong-pillar / ineffective): promo_calendar, retail_kits</w:t>
       </w:r>
     </w:p>
     <w:p/>

</xml_diff>